<commit_message>
Water sector changes doc update
</commit_message>
<xml_diff>
--- a/docs/KEN_agriculture_water_changes_2026-10.docx
+++ b/docs/KEN_agriculture_water_changes_2026-10.docx
@@ -22,47 +22,7 @@
     </w:p>
     <w:p>
       <w:r>
-        <w:t xml:space="preserve">Repository </w:t>
-      </w:r>
-      <w:r>
-        <w:rPr>
-          <w:rFonts w:ascii="Consolas" w:eastAsia="Consolas" w:hAnsi="Consolas"/>
-          <w:sz w:val="19"/>
-        </w:rPr>
-        <w:t>KEN_model_public</w:t>
-      </w:r>
-      <w:r>
-        <w:t xml:space="preserve">. The model changes are in two commits of 1 October 2026: </w:t>
-      </w:r>
-      <w:r>
-        <w:rPr>
-          <w:rFonts w:ascii="Consolas" w:eastAsia="Consolas" w:hAnsi="Consolas"/>
-          <w:sz w:val="19"/>
-        </w:rPr>
-        <w:t>d70dddc</w:t>
-      </w:r>
-      <w:r>
-        <w:t xml:space="preserve"> (agricultural sector, batch 1) and </w:t>
-      </w:r>
-      <w:r>
-        <w:rPr>
-          <w:rFonts w:ascii="Consolas" w:eastAsia="Consolas" w:hAnsi="Consolas"/>
-          <w:sz w:val="19"/>
-        </w:rPr>
-        <w:t>8fbcc2f</w:t>
-      </w:r>
-      <w:r>
-        <w:t xml:space="preserve"> (water sector and agriculture, batch 2). One plotting function was added on 6 October 2026 and is not yet committed. The command </w:t>
-      </w:r>
-      <w:r>
-        <w:rPr>
-          <w:rFonts w:ascii="Consolas" w:eastAsia="Consolas" w:hAnsi="Consolas"/>
-          <w:sz w:val="19"/>
-        </w:rPr>
-        <w:t>git diff c04e38f 8fbcc2f -- model/</w:t>
-      </w:r>
-      <w:r>
-        <w:t xml:space="preserve"> shows the complete code difference.</w:t>
+        <w:t>Repository KEN_model_public. The agriculture and water supply changes are in two commits of 1 October 2026: d70dddc (agricultural sector, batch 1) and 8fbcc2f (water sector and agriculture, batch 2). The figure function plot_agri_trilemma is in da58ec4 (6 October 2026). The water for mitigation (section 6.4) is in 16feef1 (12 October 2026). The command git diff c04e38f 16feef1 -- model/ shows the complete code difference. Document updated on 13 October 2026.</w:t>
       </w:r>
     </w:p>
     <w:p>
@@ -124,7 +84,16 @@
         <w:spacing w:after="60"/>
       </w:pPr>
       <w:r>
-        <w:t>There are 11 new scenario parameters and 12 new model variables.</w:t>
+        <w:t>Water for mitigation (solar power, hydrogen, electrification, carbon capture, tree planting) is now part of the national water balance. Tree planting gets only the treated wastewater that the reuse sector does not deliver to other users, so this wastewater is no longer counted twice.</w:t>
+      </w:r>
+    </w:p>
+    <w:p>
+      <w:pPr>
+        <w:pStyle w:val="ListBullet"/>
+        <w:spacing w:after="60"/>
+      </w:pPr>
+      <w:r>
+        <w:t>There are 11 new scenario parameters and 19 new model variables (12 for agriculture and water supply, 7 for mitigation water).</w:t>
       </w:r>
     </w:p>
     <w:p>
@@ -215,111 +184,215 @@
                 <w:rFonts w:ascii="Consolas" w:eastAsia="Consolas" w:hAnsi="Consolas"/>
                 <w:sz w:val="17"/>
               </w:rPr>
-              <w:t>get_agr_data</w:t>
-            </w:r>
-            <w:r>
-              <w:rPr>
-                <w:sz w:val="19"/>
-              </w:rPr>
-              <w:t xml:space="preserve"> (new arguments and return values); new functions </w:t>
-            </w:r>
+              <w:t>get_agr_data (new arguments and return values); new functions compute_agr_supply, agr_domestic_sourcing_share, agr_diet_consumption_shares; replace_agr_X (new signature, rebalancing); calculate_water_demand; calculate_aggregate_supply_mix (new argument p); blank self-sufficiency ratios in step2_calculate_production. Section 6.4: total water use with mitigation water, water_use_supply_mix, wwater_collectable, scaled column totals in water_accounting.</w:t>
+            </w:r>
+          </w:p>
+        </w:tc>
+      </w:tr>
+      <w:tr>
+        <w:tc>
+          <w:tcPr>
+            <w:tcW w:w="3061" w:type="dxa"/>
+          </w:tcPr>
+          <w:p>
+            <w:pPr>
+              <w:spacing w:after="40"/>
+            </w:pPr>
             <w:r>
               <w:rPr>
                 <w:rFonts w:ascii="Consolas" w:eastAsia="Consolas" w:hAnsi="Consolas"/>
                 <w:sz w:val="17"/>
               </w:rPr>
-              <w:t>compute_agr_supply</w:t>
-            </w:r>
+              <w:t>model/calibration.py</w:t>
+            </w:r>
+          </w:p>
+        </w:tc>
+        <w:tc>
+          <w:tcPr>
+            <w:tcW w:w="6350" w:type="dxa"/>
+          </w:tcPr>
+          <w:p>
+            <w:pPr>
+              <w:spacing w:after="40"/>
+            </w:pPr>
             <w:r>
               <w:rPr>
                 <w:sz w:val="19"/>
               </w:rPr>
-              <w:t xml:space="preserve">, </w:t>
+              <w:t xml:space="preserve">Section 8.2: new call of </w:t>
             </w:r>
             <w:r>
               <w:rPr>
                 <w:rFonts w:ascii="Consolas" w:eastAsia="Consolas" w:hAnsi="Consolas"/>
                 <w:sz w:val="17"/>
               </w:rPr>
-              <w:t>agr_domestic_sourcing_share</w:t>
+              <w:t>get_agr_data</w:t>
             </w:r>
             <w:r>
               <w:rPr>
                 <w:sz w:val="19"/>
               </w:rPr>
-              <w:t xml:space="preserve">, </w:t>
-            </w:r>
+              <w:t>. New section 8.2.1 with the calibrated inputs of the value-chain coupling.</w:t>
+            </w:r>
+          </w:p>
+        </w:tc>
+      </w:tr>
+      <w:tr>
+        <w:tc>
+          <w:tcPr>
+            <w:tcW w:w="3061" w:type="dxa"/>
+          </w:tcPr>
+          <w:p>
+            <w:pPr>
+              <w:spacing w:after="40"/>
+            </w:pPr>
             <w:r>
               <w:rPr>
                 <w:rFonts w:ascii="Consolas" w:eastAsia="Consolas" w:hAnsi="Consolas"/>
                 <w:sz w:val="17"/>
               </w:rPr>
-              <w:t>agr_diet_consumption_shares</w:t>
-            </w:r>
+              <w:t>model/investment_module.py</w:t>
+            </w:r>
+          </w:p>
+        </w:tc>
+        <w:tc>
+          <w:tcPr>
+            <w:tcW w:w="6350" w:type="dxa"/>
+          </w:tcPr>
+          <w:p>
+            <w:pPr>
+              <w:spacing w:after="40"/>
+            </w:pPr>
             <w:r>
               <w:rPr>
                 <w:sz w:val="19"/>
               </w:rPr>
-              <w:t xml:space="preserve">; </w:t>
-            </w:r>
+              <w:t>Section 2: investment base, requirement-based floor, two new variables. Uses water_use_supply_mix (section 6.4).</w:t>
+            </w:r>
+          </w:p>
+        </w:tc>
+      </w:tr>
+      <w:tr>
+        <w:tc>
+          <w:tcPr>
+            <w:tcW w:w="3061" w:type="dxa"/>
+          </w:tcPr>
+          <w:p>
+            <w:pPr>
+              <w:spacing w:after="40"/>
+            </w:pPr>
             <w:r>
               <w:rPr>
                 <w:rFonts w:ascii="Consolas" w:eastAsia="Consolas" w:hAnsi="Consolas"/>
                 <w:sz w:val="17"/>
               </w:rPr>
-              <w:t>replace_agr_X</w:t>
-            </w:r>
+              <w:t>model/energy_module.py</w:t>
+            </w:r>
+          </w:p>
+        </w:tc>
+        <w:tc>
+          <w:tcPr>
+            <w:tcW w:w="6350" w:type="dxa"/>
+          </w:tcPr>
+          <w:p>
+            <w:pPr>
+              <w:spacing w:after="40"/>
+            </w:pPr>
             <w:r>
               <w:rPr>
                 <w:sz w:val="19"/>
               </w:rPr>
-              <w:t xml:space="preserve"> (new signature, rebalancing); </w:t>
-            </w:r>
+              <w:t>Section 6.4: water intensities as module constants, new helpers wastewater_recovery_rate, wastewater_available_for_nexus, nexus_water_other_m3. Wastewater cap of tree planting (two places), part 6 (water for mitigation) and part 7 rewritten.</w:t>
+            </w:r>
+          </w:p>
+        </w:tc>
+      </w:tr>
+      <w:tr>
+        <w:tc>
+          <w:tcPr>
+            <w:tcW w:w="3061" w:type="dxa"/>
+          </w:tcPr>
+          <w:p>
+            <w:pPr>
+              <w:spacing w:after="40"/>
+            </w:pPr>
             <w:r>
               <w:rPr>
                 <w:rFonts w:ascii="Consolas" w:eastAsia="Consolas" w:hAnsi="Consolas"/>
                 <w:sz w:val="17"/>
               </w:rPr>
-              <w:t>calculate_water_demand</w:t>
-            </w:r>
+              <w:t>model/energy_investment_module.py</w:t>
+            </w:r>
+          </w:p>
+        </w:tc>
+        <w:tc>
+          <w:tcPr>
+            <w:tcW w:w="6350" w:type="dxa"/>
+          </w:tcPr>
+          <w:p>
+            <w:pPr>
+              <w:spacing w:after="40"/>
+            </w:pPr>
             <w:r>
               <w:rPr>
                 <w:sz w:val="19"/>
               </w:rPr>
-              <w:t xml:space="preserve">; </w:t>
-            </w:r>
+              <w:t>Nature investment follows the planting deployed in the previous period (section 6.4).</w:t>
+            </w:r>
+          </w:p>
+        </w:tc>
+      </w:tr>
+      <w:tr>
+        <w:tc>
+          <w:tcPr>
+            <w:tcW w:w="3061" w:type="dxa"/>
+          </w:tcPr>
+          <w:p>
+            <w:pPr>
+              <w:spacing w:after="40"/>
+            </w:pPr>
             <w:r>
               <w:rPr>
                 <w:rFonts w:ascii="Consolas" w:eastAsia="Consolas" w:hAnsi="Consolas"/>
                 <w:sz w:val="17"/>
               </w:rPr>
-              <w:t>calculate_aggregate_supply_mix</w:t>
-            </w:r>
+              <w:t>model/model.py</w:t>
+            </w:r>
+          </w:p>
+        </w:tc>
+        <w:tc>
+          <w:tcPr>
+            <w:tcW w:w="6350" w:type="dxa"/>
+          </w:tcPr>
+          <w:p>
+            <w:pPr>
+              <w:spacing w:after="40"/>
+            </w:pPr>
             <w:r>
               <w:rPr>
                 <w:sz w:val="19"/>
               </w:rPr>
-              <w:t xml:space="preserve"> (new argument </w:t>
+              <w:t xml:space="preserve">Import of </w:t>
             </w:r>
             <w:r>
               <w:rPr>
                 <w:rFonts w:ascii="Consolas" w:eastAsia="Consolas" w:hAnsi="Consolas"/>
                 <w:sz w:val="17"/>
               </w:rPr>
-              <w:t>p</w:t>
+              <w:t>agr_diet_consumption_shares</w:t>
             </w:r>
             <w:r>
               <w:rPr>
                 <w:sz w:val="19"/>
               </w:rPr>
-              <w:t xml:space="preserve">); blank self-sufficiency ratios in </w:t>
+              <w:t xml:space="preserve">; diet shares set at the start of each step; </w:t>
             </w:r>
             <w:r>
               <w:rPr>
                 <w:rFonts w:ascii="Consolas" w:eastAsia="Consolas" w:hAnsi="Consolas"/>
                 <w:sz w:val="17"/>
               </w:rPr>
-              <w:t>step2_calculate_production</w:t>
+              <w:t>replace_agr_X(v, pc, t, p)</w:t>
             </w:r>
             <w:r>
               <w:rPr>
@@ -344,7 +417,7 @@
                 <w:rFonts w:ascii="Consolas" w:eastAsia="Consolas" w:hAnsi="Consolas"/>
                 <w:sz w:val="17"/>
               </w:rPr>
-              <w:t>model/calibration.py</w:t>
+              <w:t>model/endogenize_input_output_matrix_A.py</w:t>
             </w:r>
           </w:p>
         </w:tc>
@@ -356,24 +429,18 @@
             <w:pPr>
               <w:spacing w:after="40"/>
             </w:pPr>
-            <w:r>
-              <w:rPr>
-                <w:sz w:val="19"/>
-              </w:rPr>
-              <w:t xml:space="preserve">Section 8.2: new call of </w:t>
-            </w:r>
             <w:r>
               <w:rPr>
                 <w:rFonts w:ascii="Consolas" w:eastAsia="Consolas" w:hAnsi="Consolas"/>
                 <w:sz w:val="17"/>
               </w:rPr>
-              <w:t>get_agr_data</w:t>
+              <w:t>replace_agr_X(v, pc, t, p)</w:t>
             </w:r>
             <w:r>
               <w:rPr>
                 <w:sz w:val="19"/>
               </w:rPr>
-              <w:t>. New section 8.2.1 with the calibrated inputs of the value-chain coupling.</w:t>
+              <w:t>.</w:t>
             </w:r>
           </w:p>
         </w:tc>
@@ -392,7 +459,7 @@
                 <w:rFonts w:ascii="Consolas" w:eastAsia="Consolas" w:hAnsi="Consolas"/>
                 <w:sz w:val="17"/>
               </w:rPr>
-              <w:t>model/investment_module.py</w:t>
+              <w:t>model/model_classes.py</w:t>
             </w:r>
           </w:p>
         </w:tc>
@@ -408,7 +475,7 @@
               <w:rPr>
                 <w:sz w:val="19"/>
               </w:rPr>
-              <w:t>Section 2: investment base, requirement-based floor, two new variables.</w:t>
+              <w:t>19 new variables in ModelVariables (section 8).</w:t>
             </w:r>
           </w:p>
         </w:tc>
@@ -427,7 +494,13 @@
                 <w:rFonts w:ascii="Consolas" w:eastAsia="Consolas" w:hAnsi="Consolas"/>
                 <w:sz w:val="17"/>
               </w:rPr>
-              <w:t>model/model.py</w:t>
+              <w:t>model/parameters_*.py</w:t>
+            </w:r>
+            <w:r>
+              <w:rPr>
+                <w:sz w:val="19"/>
+              </w:rPr>
+              <w:t xml:space="preserve"> (4 files)</w:t>
             </w:r>
           </w:p>
         </w:tc>
@@ -443,33 +516,43 @@
               <w:rPr>
                 <w:sz w:val="19"/>
               </w:rPr>
-              <w:t xml:space="preserve">Import of </w:t>
-            </w:r>
+              <w:t>11 new parameters, with scenario-specific values.</w:t>
+            </w:r>
+          </w:p>
+        </w:tc>
+      </w:tr>
+      <w:tr>
+        <w:tc>
+          <w:tcPr>
+            <w:tcW w:w="3061" w:type="dxa"/>
+          </w:tcPr>
+          <w:p>
+            <w:pPr>
+              <w:spacing w:after="40"/>
+            </w:pPr>
             <w:r>
               <w:rPr>
                 <w:rFonts w:ascii="Consolas" w:eastAsia="Consolas" w:hAnsi="Consolas"/>
                 <w:sz w:val="17"/>
               </w:rPr>
-              <w:t>agr_diet_consumption_shares</w:t>
-            </w:r>
-            <w:r>
-              <w:rPr>
-                <w:sz w:val="19"/>
-              </w:rPr>
-              <w:t xml:space="preserve">; diet shares set at the start of each step; </w:t>
-            </w:r>
+              <w:t>model/plot_water_results.py</w:t>
+            </w:r>
+          </w:p>
+        </w:tc>
+        <w:tc>
+          <w:tcPr>
+            <w:tcW w:w="6350" w:type="dxa"/>
+          </w:tcPr>
+          <w:p>
+            <w:pPr>
+              <w:spacing w:after="40"/>
+            </w:pPr>
             <w:r>
               <w:rPr>
                 <w:rFonts w:ascii="Consolas" w:eastAsia="Consolas" w:hAnsi="Consolas"/>
                 <w:sz w:val="17"/>
               </w:rPr>
-              <w:t>replace_agr_X(v, pc, t, p)</w:t>
-            </w:r>
-            <w:r>
-              <w:rPr>
-                <w:sz w:val="19"/>
-              </w:rPr>
-              <w:t>.</w:t>
+              <w:t>WaterResultRunner no longer re-injects agriculture data; new figure function plot_agri_trilemma. Reuse series include the wastewater used for mitigation. resolve_overlaps takes the axis as second argument.</w:t>
             </w:r>
           </w:p>
         </w:tc>
@@ -488,7 +571,7 @@
                 <w:rFonts w:ascii="Consolas" w:eastAsia="Consolas" w:hAnsi="Consolas"/>
                 <w:sz w:val="17"/>
               </w:rPr>
-              <w:t>model/endogenize_input_output_matrix_A.py</w:t>
+              <w:t>model/experiment_plots.py, model/postprocessing_energy.py</w:t>
             </w:r>
           </w:p>
         </w:tc>
@@ -505,157 +588,7 @@
                 <w:rFonts w:ascii="Consolas" w:eastAsia="Consolas" w:hAnsi="Consolas"/>
                 <w:sz w:val="17"/>
               </w:rPr>
-              <w:t>replace_agr_X(v, pc, t, p)</w:t>
-            </w:r>
-            <w:r>
-              <w:rPr>
-                <w:sz w:val="19"/>
-              </w:rPr>
-              <w:t>.</w:t>
-            </w:r>
-          </w:p>
-        </w:tc>
-      </w:tr>
-      <w:tr>
-        <w:tc>
-          <w:tcPr>
-            <w:tcW w:w="3061" w:type="dxa"/>
-          </w:tcPr>
-          <w:p>
-            <w:pPr>
-              <w:spacing w:after="40"/>
-            </w:pPr>
-            <w:r>
-              <w:rPr>
-                <w:rFonts w:ascii="Consolas" w:eastAsia="Consolas" w:hAnsi="Consolas"/>
-                <w:sz w:val="17"/>
-              </w:rPr>
-              <w:t>model/model_classes.py</w:t>
-            </w:r>
-          </w:p>
-        </w:tc>
-        <w:tc>
-          <w:tcPr>
-            <w:tcW w:w="6350" w:type="dxa"/>
-          </w:tcPr>
-          <w:p>
-            <w:pPr>
-              <w:spacing w:after="40"/>
-            </w:pPr>
-            <w:r>
-              <w:rPr>
-                <w:sz w:val="19"/>
-              </w:rPr>
-              <w:t xml:space="preserve">12 new variables in </w:t>
-            </w:r>
-            <w:r>
-              <w:rPr>
-                <w:rFonts w:ascii="Consolas" w:eastAsia="Consolas" w:hAnsi="Consolas"/>
-                <w:sz w:val="17"/>
-              </w:rPr>
-              <w:t>ModelVariables</w:t>
-            </w:r>
-            <w:r>
-              <w:rPr>
-                <w:sz w:val="19"/>
-              </w:rPr>
-              <w:t>.</w:t>
-            </w:r>
-          </w:p>
-        </w:tc>
-      </w:tr>
-      <w:tr>
-        <w:tc>
-          <w:tcPr>
-            <w:tcW w:w="3061" w:type="dxa"/>
-          </w:tcPr>
-          <w:p>
-            <w:pPr>
-              <w:spacing w:after="40"/>
-            </w:pPr>
-            <w:r>
-              <w:rPr>
-                <w:rFonts w:ascii="Consolas" w:eastAsia="Consolas" w:hAnsi="Consolas"/>
-                <w:sz w:val="17"/>
-              </w:rPr>
-              <w:t>model/parameters_*.py</w:t>
-            </w:r>
-            <w:r>
-              <w:rPr>
-                <w:sz w:val="19"/>
-              </w:rPr>
-              <w:t xml:space="preserve"> (4 files)</w:t>
-            </w:r>
-          </w:p>
-        </w:tc>
-        <w:tc>
-          <w:tcPr>
-            <w:tcW w:w="6350" w:type="dxa"/>
-          </w:tcPr>
-          <w:p>
-            <w:pPr>
-              <w:spacing w:after="40"/>
-            </w:pPr>
-            <w:r>
-              <w:rPr>
-                <w:sz w:val="19"/>
-              </w:rPr>
-              <w:t>11 new parameters, with scenario-specific values.</w:t>
-            </w:r>
-          </w:p>
-        </w:tc>
-      </w:tr>
-      <w:tr>
-        <w:tc>
-          <w:tcPr>
-            <w:tcW w:w="3061" w:type="dxa"/>
-          </w:tcPr>
-          <w:p>
-            <w:pPr>
-              <w:spacing w:after="40"/>
-            </w:pPr>
-            <w:r>
-              <w:rPr>
-                <w:rFonts w:ascii="Consolas" w:eastAsia="Consolas" w:hAnsi="Consolas"/>
-                <w:sz w:val="17"/>
-              </w:rPr>
-              <w:t>model/plot_water_results.py</w:t>
-            </w:r>
-          </w:p>
-        </w:tc>
-        <w:tc>
-          <w:tcPr>
-            <w:tcW w:w="6350" w:type="dxa"/>
-          </w:tcPr>
-          <w:p>
-            <w:pPr>
-              <w:spacing w:after="40"/>
-            </w:pPr>
-            <w:r>
-              <w:rPr>
-                <w:rFonts w:ascii="Consolas" w:eastAsia="Consolas" w:hAnsi="Consolas"/>
-                <w:sz w:val="17"/>
-              </w:rPr>
-              <w:t>WaterResultRunner</w:t>
-            </w:r>
-            <w:r>
-              <w:rPr>
-                <w:sz w:val="19"/>
-              </w:rPr>
-              <w:t xml:space="preserve"> no longer re-injects agriculture data; new figure function </w:t>
-            </w:r>
-            <w:r>
-              <w:rPr>
-                <w:rFonts w:ascii="Consolas" w:eastAsia="Consolas" w:hAnsi="Consolas"/>
-                <w:sz w:val="17"/>
-              </w:rPr>
-              <w:t>plot_agri_trilemma</w:t>
-            </w:r>
-            <w:r>
-              <w:rPr>
-                <w:sz w:val="19"/>
-              </w:rPr>
-              <w:t>.</w:t>
+              <w:t>Plots only: reports are cut to 2021 to 2060 before plotting, and the nexus figure reads water_use_nexus and electricity_nexus_water_total from the run.</w:t>
             </w:r>
           </w:p>
         </w:tc>
@@ -1875,7 +1808,7 @@
           <w:rFonts w:ascii="Consolas" w:hAnsi="Consolas"/>
           <w:sz w:val="19"/>
         </w:rPr>
-        <w:t>expected_demand  = W[t-1] * (W[t-1] / W[t-2])^2     (W = water_use_total_national)</w:t>
+        <w:t>expected_demand  = W[t-1] * (W[t-1] / W[t-2])^2     (W = water_use_supply_mix, section 6.4)</w:t>
       </w:r>
     </w:p>
     <w:p>
@@ -2080,6 +2013,218 @@
       </w:r>
       <w:r>
         <w:t>. If it exceeds 1 million m3, it is met by groundwater, so the water balance stays closed and the gap is visible as a diagnostic.</w:t>
+      </w:r>
+    </w:p>
+    <w:p>
+      <w:pPr>
+        <w:pStyle w:val="Heading2"/>
+      </w:pPr>
+      <w:r>
+        <w:t>6.4 Water for mitigation</w:t>
+      </w:r>
+    </w:p>
+    <w:p>
+      <w:r>
+        <w:t>The energy module computes the water that mitigation needs. Before, this water was not part of the national water balance: the energy module added it to water_use_total_national, and the water module, which runs later in the period, overwrote the total. Tree planting was limited by all collectable urban wastewater, although the reuse sector already delivers part of it to other users.</w:t>
+      </w:r>
+    </w:p>
+    <w:p>
+      <w:r>
+        <w:t>New helpers at the top of energy_module.py. The water intensities are now module constants (WI_SOLAR, WI_HYDROGEN, WI_SGI_BM3_PER_MT and so on), with unchanged values:</w:t>
+      </w:r>
+    </w:p>
+    <w:p>
+      <w:pPr>
+        <w:spacing w:after="0"/>
+        <w:ind w:left="454"/>
+      </w:pPr>
+      <w:r>
+        <w:rPr>
+          <w:rFonts w:ascii="Consolas" w:hAnsi="Consolas"/>
+          <w:sz w:val="19"/>
+        </w:rPr>
+        <w:t>wastewater_recovery_rate(t)          = min(0.30 + 0.02 * (t - 1), 0.80)</w:t>
+      </w:r>
+    </w:p>
+    <w:p>
+      <w:pPr>
+        <w:spacing w:after="0"/>
+        <w:ind w:left="454"/>
+      </w:pPr>
+      <w:r>
+        <w:rPr>
+          <w:rFonts w:ascii="Consolas" w:hAnsi="Consolas"/>
+          <w:sz w:val="19"/>
+        </w:rPr>
+        <w:t>wastewater_available_for_nexus(v, t) = urban[t-1] * g_urban * recovery_rate(t) - water_use_wwater_tot[t-1] * g_reuse</w:t>
+      </w:r>
+    </w:p>
+    <w:p>
+      <w:pPr>
+        <w:spacing w:after="0"/>
+        <w:ind w:left="454"/>
+      </w:pPr>
+      <w:r>
+        <w:rPr>
+          <w:rFonts w:ascii="Consolas" w:hAnsi="Consolas"/>
+          <w:sz w:val="19"/>
+        </w:rPr>
+        <w:t>nexus_water_other_m3(v, pc, t)       = water for solar, wind, hydrogen, electrification, CCS and CCU</w:t>
+      </w:r>
+    </w:p>
+    <w:p>
+      <w:r>
+        <w:t>urban is household, industry and service water use. g_urban and g_reuse are the growth factors of the last period: both terms are projected one period ahead, because the water module runs after the energy module.</w:t>
+      </w:r>
+    </w:p>
+    <w:p>
+      <w:r>
+        <w:t>Tree planting (in both scenario branches) and the sources of the mitigation water (part 6):</w:t>
+      </w:r>
+    </w:p>
+    <w:p>
+      <w:pPr>
+        <w:spacing w:after="0"/>
+        <w:ind w:left="454"/>
+      </w:pPr>
+      <w:r>
+        <w:rPr>
+          <w:rFonts w:ascii="Consolas" w:hAnsi="Consolas"/>
+          <w:sz w:val="19"/>
+        </w:rPr>
+        <w:t>avail_for_sgi          = max(0, wastewater_available_for_nexus - nexus_water_other_m3)</w:t>
+      </w:r>
+    </w:p>
+    <w:p>
+      <w:pPr>
+        <w:spacing w:after="0"/>
+        <w:ind w:left="454"/>
+      </w:pPr>
+      <w:r>
+        <w:rPr>
+          <w:rFonts w:ascii="Consolas" w:hAnsi="Consolas"/>
+          <w:sz w:val="19"/>
+        </w:rPr>
+        <w:t>flow_remove_nature[t]  = min(intended, avail_for_sgi / 0.315e9)          (0.315 billion m3 per Mt CO2)</w:t>
+      </w:r>
+    </w:p>
+    <w:p>
+      <w:pPr>
+        <w:spacing w:after="0"/>
+        <w:ind w:left="454"/>
+      </w:pPr>
+      <w:r>
+        <w:rPr>
+          <w:rFonts w:ascii="Consolas" w:hAnsi="Consolas"/>
+          <w:sz w:val="19"/>
+        </w:rPr>
+        <w:t>water_use_nexus[t]     = nexus_water_other_m3 + flow_remove_nature[t] * 0.315e9</w:t>
+      </w:r>
+    </w:p>
+    <w:p>
+      <w:pPr>
+        <w:spacing w:after="0"/>
+        <w:ind w:left="454"/>
+      </w:pPr>
+      <w:r>
+        <w:rPr>
+          <w:rFonts w:ascii="Consolas" w:hAnsi="Consolas"/>
+          <w:sz w:val="19"/>
+        </w:rPr>
+        <w:t>water_energy_wwater[t] = min(water_use_nexus[t], wastewater_available_for_nexus)   (0 without mitigation policy)</w:t>
+      </w:r>
+    </w:p>
+    <w:p>
+      <w:pPr>
+        <w:spacing w:after="0"/>
+        <w:ind w:left="454"/>
+      </w:pPr>
+      <w:r>
+        <w:rPr>
+          <w:rFonts w:ascii="Consolas" w:hAnsi="Consolas"/>
+          <w:sz w:val="19"/>
+        </w:rPr>
+        <w:t>shortfall              = water_use_nexus[t] - water_energy_wwater[t]:  70% water_energy_desal, 30% water_energy_gw</w:t>
+      </w:r>
+    </w:p>
+    <w:p>
+      <w:r>
+        <w:t>In the water module (calculate_water_demand):</w:t>
+      </w:r>
+    </w:p>
+    <w:p>
+      <w:pPr>
+        <w:spacing w:after="0"/>
+        <w:ind w:left="454"/>
+      </w:pPr>
+      <w:r>
+        <w:rPr>
+          <w:rFonts w:ascii="Consolas" w:hAnsi="Consolas"/>
+          <w:sz w:val="19"/>
+        </w:rPr>
+        <w:t>water_use_total_national[t] = sectors + households + water_use_nexus[t]</w:t>
+      </w:r>
+    </w:p>
+    <w:p>
+      <w:pPr>
+        <w:spacing w:after="0"/>
+        <w:ind w:left="454"/>
+      </w:pPr>
+      <w:r>
+        <w:rPr>
+          <w:rFonts w:ascii="Consolas" w:hAnsi="Consolas"/>
+          <w:sz w:val="19"/>
+        </w:rPr>
+        <w:t>water_use_supply_mix[t]     = water_use_total_national[t] - water_energy_wwater[t]</w:t>
+      </w:r>
+    </w:p>
+    <w:p>
+      <w:pPr>
+        <w:spacing w:after="0"/>
+        <w:ind w:left="454"/>
+      </w:pPr>
+      <w:r>
+        <w:rPr>
+          <w:rFonts w:ascii="Consolas" w:hAnsi="Consolas"/>
+          <w:sz w:val="19"/>
+        </w:rPr>
+        <w:t>wwater_collectable[t]       = (households + industry + services) * wastewater_recovery_rate(t)</w:t>
+      </w:r>
+    </w:p>
+    <w:p>
+      <w:pPr>
+        <w:pStyle w:val="ListBullet"/>
+        <w:spacing w:after="60"/>
+      </w:pPr>
+      <w:r>
+        <w:t>calculate_aggregate_supply_mix and section 2 of the investment module now use water_use_supply_mix where they used water_use_total_national. Desalination, sector reuse and groundwater supply this amount. The wastewater for mitigation is a supply stream of its own.</w:t>
+      </w:r>
+    </w:p>
+    <w:p>
+      <w:pPr>
+        <w:pStyle w:val="ListBullet"/>
+        <w:spacing w:after="60"/>
+      </w:pPr>
+      <w:r>
+        <w:t>In water_accounting the column totals of the RAS matrix are scaled to the demand of the four user groups, because mitigation water is not a row of the matrix.</w:t>
+      </w:r>
+    </w:p>
+    <w:p>
+      <w:pPr>
+        <w:pStyle w:val="ListBullet"/>
+        <w:spacing w:after="60"/>
+      </w:pPr>
+      <w:r>
+        <w:t>In energy_investment_module.py the nature investment of the net zero branch follows the planting deployed in the previous period (flow_remove_nature[t-1] - flow_remove_nature[t-2]), not the uncapped target path.</w:t>
+      </w:r>
+    </w:p>
+    <w:p>
+      <w:pPr>
+        <w:pStyle w:val="ListBullet"/>
+        <w:spacing w:after="60"/>
+      </w:pPr>
+      <w:r>
+        <w:t>The electricity to supply this water is stored in electricity_nexus_water_total. It is added to electricity generation only with p.nexus_water_electricity_feedback = True. The parameter is read with getattr, is not in the parameter files and is off by default: the load is below 0.4% of electricity use, but it shifts a threshold in the Vision 2030 run around 2040 and moves its 2060 GDP by about 1%.</w:t>
       </w:r>
     </w:p>
     <w:p>
@@ -3598,6 +3743,251 @@
           </w:p>
         </w:tc>
       </w:tr>
+      <w:tr>
+        <w:tc>
+          <w:tcPr>
+            <w:tcW w:w="3061" w:type="dxa"/>
+          </w:tcPr>
+          <w:p>
+            <w:pPr>
+              <w:spacing w:after="40"/>
+            </w:pPr>
+            <w:r>
+              <w:rPr>
+                <w:rFonts w:ascii="Consolas" w:eastAsia="Consolas" w:hAnsi="Consolas"/>
+                <w:sz w:val="17"/>
+              </w:rPr>
+              <w:t>water_use_nexus</w:t>
+            </w:r>
+          </w:p>
+        </w:tc>
+        <w:tc>
+          <w:tcPr>
+            <w:tcW w:w="6350" w:type="dxa"/>
+          </w:tcPr>
+          <w:p>
+            <w:pPr>
+              <w:spacing w:after="40"/>
+            </w:pPr>
+            <w:r>
+              <w:rPr>
+                <w:sz w:val="19"/>
+              </w:rPr>
+              <w:t>Water use of mitigation technologies and tree planting (m3), part of water_use_total_national.</w:t>
+            </w:r>
+          </w:p>
+        </w:tc>
+      </w:tr>
+      <w:tr>
+        <w:tc>
+          <w:tcPr>
+            <w:tcW w:w="3061" w:type="dxa"/>
+          </w:tcPr>
+          <w:p>
+            <w:pPr>
+              <w:spacing w:after="40"/>
+            </w:pPr>
+            <w:r>
+              <w:rPr>
+                <w:rFonts w:ascii="Consolas" w:eastAsia="Consolas" w:hAnsi="Consolas"/>
+                <w:sz w:val="17"/>
+              </w:rPr>
+              <w:t>water_energy_wwater</w:t>
+            </w:r>
+          </w:p>
+        </w:tc>
+        <w:tc>
+          <w:tcPr>
+            <w:tcW w:w="6350" w:type="dxa"/>
+          </w:tcPr>
+          <w:p>
+            <w:pPr>
+              <w:spacing w:after="40"/>
+            </w:pPr>
+            <w:r>
+              <w:rPr>
+                <w:sz w:val="19"/>
+              </w:rPr>
+              <w:t>Part of it supplied by reclaimed wastewater not delivered to other users (m3).</w:t>
+            </w:r>
+          </w:p>
+        </w:tc>
+      </w:tr>
+      <w:tr>
+        <w:tc>
+          <w:tcPr>
+            <w:tcW w:w="3061" w:type="dxa"/>
+          </w:tcPr>
+          <w:p>
+            <w:pPr>
+              <w:spacing w:after="40"/>
+            </w:pPr>
+            <w:r>
+              <w:rPr>
+                <w:rFonts w:ascii="Consolas" w:eastAsia="Consolas" w:hAnsi="Consolas"/>
+                <w:sz w:val="17"/>
+              </w:rPr>
+              <w:t>water_energy_desal</w:t>
+            </w:r>
+          </w:p>
+        </w:tc>
+        <w:tc>
+          <w:tcPr>
+            <w:tcW w:w="6350" w:type="dxa"/>
+          </w:tcPr>
+          <w:p>
+            <w:pPr>
+              <w:spacing w:after="40"/>
+            </w:pPr>
+            <w:r>
+              <w:rPr>
+                <w:sz w:val="19"/>
+              </w:rPr>
+              <w:t>Part of it supplied by desalination (m3), shortfall only.</w:t>
+            </w:r>
+          </w:p>
+        </w:tc>
+      </w:tr>
+      <w:tr>
+        <w:tc>
+          <w:tcPr>
+            <w:tcW w:w="3061" w:type="dxa"/>
+          </w:tcPr>
+          <w:p>
+            <w:pPr>
+              <w:spacing w:after="40"/>
+            </w:pPr>
+            <w:r>
+              <w:rPr>
+                <w:rFonts w:ascii="Consolas" w:eastAsia="Consolas" w:hAnsi="Consolas"/>
+                <w:sz w:val="17"/>
+              </w:rPr>
+              <w:t>water_energy_gw</w:t>
+            </w:r>
+          </w:p>
+        </w:tc>
+        <w:tc>
+          <w:tcPr>
+            <w:tcW w:w="6350" w:type="dxa"/>
+          </w:tcPr>
+          <w:p>
+            <w:pPr>
+              <w:spacing w:after="40"/>
+            </w:pPr>
+            <w:r>
+              <w:rPr>
+                <w:sz w:val="19"/>
+              </w:rPr>
+              <w:t>Part of it supplied by groundwater (m3), shortfall only.</w:t>
+            </w:r>
+          </w:p>
+        </w:tc>
+      </w:tr>
+      <w:tr>
+        <w:tc>
+          <w:tcPr>
+            <w:tcW w:w="3061" w:type="dxa"/>
+          </w:tcPr>
+          <w:p>
+            <w:pPr>
+              <w:spacing w:after="40"/>
+            </w:pPr>
+            <w:r>
+              <w:rPr>
+                <w:rFonts w:ascii="Consolas" w:eastAsia="Consolas" w:hAnsi="Consolas"/>
+                <w:sz w:val="17"/>
+              </w:rPr>
+              <w:t>water_use_supply_mix</w:t>
+            </w:r>
+          </w:p>
+        </w:tc>
+        <w:tc>
+          <w:tcPr>
+            <w:tcW w:w="6350" w:type="dxa"/>
+          </w:tcPr>
+          <w:p>
+            <w:pPr>
+              <w:spacing w:after="40"/>
+            </w:pPr>
+            <w:r>
+              <w:rPr>
+                <w:sz w:val="19"/>
+              </w:rPr>
+              <w:t>Water use met by desalination, sector reuse and groundwater: total minus water_energy_wwater (m3).</w:t>
+            </w:r>
+          </w:p>
+        </w:tc>
+      </w:tr>
+      <w:tr>
+        <w:tc>
+          <w:tcPr>
+            <w:tcW w:w="3061" w:type="dxa"/>
+          </w:tcPr>
+          <w:p>
+            <w:pPr>
+              <w:spacing w:after="40"/>
+            </w:pPr>
+            <w:r>
+              <w:rPr>
+                <w:rFonts w:ascii="Consolas" w:eastAsia="Consolas" w:hAnsi="Consolas"/>
+                <w:sz w:val="17"/>
+              </w:rPr>
+              <w:t>wwater_collectable</w:t>
+            </w:r>
+          </w:p>
+        </w:tc>
+        <w:tc>
+          <w:tcPr>
+            <w:tcW w:w="6350" w:type="dxa"/>
+          </w:tcPr>
+          <w:p>
+            <w:pPr>
+              <w:spacing w:after="40"/>
+            </w:pPr>
+            <w:r>
+              <w:rPr>
+                <w:sz w:val="19"/>
+              </w:rPr>
+              <w:t>Collectable urban wastewater: recovery rate times household, industry and service water use (m3).</w:t>
+            </w:r>
+          </w:p>
+        </w:tc>
+      </w:tr>
+      <w:tr>
+        <w:tc>
+          <w:tcPr>
+            <w:tcW w:w="3061" w:type="dxa"/>
+          </w:tcPr>
+          <w:p>
+            <w:pPr>
+              <w:spacing w:after="40"/>
+            </w:pPr>
+            <w:r>
+              <w:rPr>
+                <w:rFonts w:ascii="Consolas" w:eastAsia="Consolas" w:hAnsi="Consolas"/>
+                <w:sz w:val="17"/>
+              </w:rPr>
+              <w:t>electricity_nexus_water_total</w:t>
+            </w:r>
+          </w:p>
+        </w:tc>
+        <w:tc>
+          <w:tcPr>
+            <w:tcW w:w="6350" w:type="dxa"/>
+          </w:tcPr>
+          <w:p>
+            <w:pPr>
+              <w:spacing w:after="40"/>
+            </w:pPr>
+            <w:r>
+              <w:rPr>
+                <w:sz w:val="19"/>
+              </w:rPr>
+              <w:t>Electricity to supply the water for mitigation (GJ).</w:t>
+            </w:r>
+          </w:p>
+        </w:tc>
+      </w:tr>
     </w:tbl>
     <w:p>
       <w:pPr>
@@ -3843,6 +4233,24 @@
     </w:p>
     <w:p>
       <w:pPr>
+        <w:pStyle w:val="ListBullet"/>
+        <w:spacing w:after="60"/>
+      </w:pPr>
+      <w:r>
+        <w:t>plot_agri_trilemma shows output and imports in current prices (X, IM), like the other monetary figures. The check values in section 11 are in 2021 prices (x, im).</w:t>
+      </w:r>
+    </w:p>
+    <w:p>
+      <w:pPr>
+        <w:pStyle w:val="ListBullet"/>
+        <w:spacing w:after="60"/>
+      </w:pPr>
+      <w:r>
+        <w:t>experiment_plots.py cuts all reports to 2021 to 2060 before plotting (_truncate_reports). The 2021 start labels of the GDP shares are computed from the Baseline run and no longer hard-coded.</w:t>
+      </w:r>
+    </w:p>
+    <w:p>
+      <w:pPr>
         <w:pStyle w:val="Heading1"/>
       </w:pPr>
       <w:r>
@@ -4029,6 +4437,15 @@
         <w:spacing w:after="60"/>
       </w:pPr>
       <w:r>
+        <w:t>Add the helpers, the wastewater cap and the new part 6 in energy_module.py, the 7 variables of section 6.4, and the water_use_supply_mix changes in water_module.py and investment_module.py.</w:t>
+      </w:r>
+    </w:p>
+    <w:p>
+      <w:pPr>
+        <w:pStyle w:val="ListNumber"/>
+        <w:spacing w:after="60"/>
+      </w:pPr>
+      <w:r>
         <w:t xml:space="preserve">Remove the agriculture injection from any custom runner, as in </w:t>
       </w:r>
       <w:r>
@@ -4053,7 +4470,7 @@
     </w:p>
     <w:p>
       <w:r>
-        <w:t>With the current code and the saved results of 6 October 2026, the 2060 values are:</w:t>
+        <w:t>With the current code (commit 16feef1, run of 13 October 2026), the 2060 values are:</w:t>
       </w:r>
     </w:p>
     <w:tbl>
@@ -4336,7 +4753,271 @@
               <w:rPr>
                 <w:sz w:val="19"/>
               </w:rPr>
-              <w:t>354.5</w:t>
+              <w:t>354.3</w:t>
+            </w:r>
+          </w:p>
+        </w:tc>
+      </w:tr>
+      <w:tr>
+        <w:tc>
+          <w:tcPr>
+            <w:tcW w:w="4422" w:type="dxa"/>
+          </w:tcPr>
+          <w:p>
+            <w:pPr>
+              <w:spacing w:after="40"/>
+            </w:pPr>
+            <w:r>
+              <w:rPr>
+                <w:sz w:val="19"/>
+              </w:rPr>
+              <w:t>Total water use, billion m3</w:t>
+            </w:r>
+          </w:p>
+        </w:tc>
+        <w:tc>
+          <w:tcPr>
+            <w:tcW w:w="1531" w:type="dxa"/>
+          </w:tcPr>
+          <w:p>
+            <w:pPr>
+              <w:spacing w:after="40"/>
+            </w:pPr>
+            <w:r>
+              <w:rPr>
+                <w:sz w:val="19"/>
+              </w:rPr>
+              <w:t>28.9</w:t>
+            </w:r>
+          </w:p>
+        </w:tc>
+        <w:tc>
+          <w:tcPr>
+            <w:tcW w:w="1531" w:type="dxa"/>
+          </w:tcPr>
+          <w:p>
+            <w:pPr>
+              <w:spacing w:after="40"/>
+            </w:pPr>
+            <w:r>
+              <w:rPr>
+                <w:sz w:val="19"/>
+              </w:rPr>
+              <w:t>32.7</w:t>
+            </w:r>
+          </w:p>
+        </w:tc>
+        <w:tc>
+          <w:tcPr>
+            <w:tcW w:w="1928" w:type="dxa"/>
+          </w:tcPr>
+          <w:p>
+            <w:pPr>
+              <w:spacing w:after="40"/>
+            </w:pPr>
+            <w:r>
+              <w:rPr>
+                <w:sz w:val="19"/>
+              </w:rPr>
+              <w:t>29.1</w:t>
+            </w:r>
+          </w:p>
+        </w:tc>
+      </w:tr>
+      <w:tr>
+        <w:tc>
+          <w:tcPr>
+            <w:tcW w:w="4422" w:type="dxa"/>
+          </w:tcPr>
+          <w:p>
+            <w:pPr>
+              <w:spacing w:after="40"/>
+            </w:pPr>
+            <w:r>
+              <w:rPr>
+                <w:sz w:val="19"/>
+              </w:rPr>
+              <w:t>Water for mitigation, billion m3 (all from treated wastewater)</w:t>
+            </w:r>
+          </w:p>
+        </w:tc>
+        <w:tc>
+          <w:tcPr>
+            <w:tcW w:w="1531" w:type="dxa"/>
+          </w:tcPr>
+          <w:p>
+            <w:pPr>
+              <w:spacing w:after="40"/>
+            </w:pPr>
+            <w:r>
+              <w:rPr>
+                <w:sz w:val="19"/>
+              </w:rPr>
+              <w:t>1.20</w:t>
+            </w:r>
+          </w:p>
+        </w:tc>
+        <w:tc>
+          <w:tcPr>
+            <w:tcW w:w="1531" w:type="dxa"/>
+          </w:tcPr>
+          <w:p>
+            <w:pPr>
+              <w:spacing w:after="40"/>
+            </w:pPr>
+            <w:r>
+              <w:rPr>
+                <w:sz w:val="19"/>
+              </w:rPr>
+              <w:t>1.27</w:t>
+            </w:r>
+          </w:p>
+        </w:tc>
+        <w:tc>
+          <w:tcPr>
+            <w:tcW w:w="1928" w:type="dxa"/>
+          </w:tcPr>
+          <w:p>
+            <w:pPr>
+              <w:spacing w:after="40"/>
+            </w:pPr>
+            <w:r>
+              <w:rPr>
+                <w:sz w:val="19"/>
+              </w:rPr>
+              <w:t>3.08</w:t>
+            </w:r>
+          </w:p>
+        </w:tc>
+      </w:tr>
+      <w:tr>
+        <w:tc>
+          <w:tcPr>
+            <w:tcW w:w="4422" w:type="dxa"/>
+          </w:tcPr>
+          <w:p>
+            <w:pPr>
+              <w:spacing w:after="40"/>
+            </w:pPr>
+            <w:r>
+              <w:rPr>
+                <w:sz w:val="19"/>
+              </w:rPr>
+              <w:t>Sector reuse plus mitigation wastewater / collectable wastewater, billion m3</w:t>
+            </w:r>
+          </w:p>
+        </w:tc>
+        <w:tc>
+          <w:tcPr>
+            <w:tcW w:w="1531" w:type="dxa"/>
+          </w:tcPr>
+          <w:p>
+            <w:pPr>
+              <w:spacing w:after="40"/>
+            </w:pPr>
+            <w:r>
+              <w:rPr>
+                <w:sz w:val="19"/>
+              </w:rPr>
+              <w:t>5.55 / 8.68</w:t>
+            </w:r>
+          </w:p>
+        </w:tc>
+        <w:tc>
+          <w:tcPr>
+            <w:tcW w:w="1531" w:type="dxa"/>
+          </w:tcPr>
+          <w:p>
+            <w:pPr>
+              <w:spacing w:after="40"/>
+            </w:pPr>
+            <w:r>
+              <w:rPr>
+                <w:sz w:val="19"/>
+              </w:rPr>
+              <w:t>7.88 / 11.58</w:t>
+            </w:r>
+          </w:p>
+        </w:tc>
+        <w:tc>
+          <w:tcPr>
+            <w:tcW w:w="1928" w:type="dxa"/>
+          </w:tcPr>
+          <w:p>
+            <w:pPr>
+              <w:spacing w:after="40"/>
+            </w:pPr>
+            <w:r>
+              <w:rPr>
+                <w:sz w:val="19"/>
+              </w:rPr>
+              <w:t>12.15 / 12.17</w:t>
+            </w:r>
+          </w:p>
+        </w:tc>
+      </w:tr>
+      <w:tr>
+        <w:tc>
+          <w:tcPr>
+            <w:tcW w:w="4422" w:type="dxa"/>
+          </w:tcPr>
+          <w:p>
+            <w:pPr>
+              <w:spacing w:after="40"/>
+            </w:pPr>
+            <w:r>
+              <w:rPr>
+                <w:sz w:val="19"/>
+              </w:rPr>
+              <w:t>Tree planting, Mt CO2 per year</w:t>
+            </w:r>
+          </w:p>
+        </w:tc>
+        <w:tc>
+          <w:tcPr>
+            <w:tcW w:w="1531" w:type="dxa"/>
+          </w:tcPr>
+          <w:p>
+            <w:pPr>
+              <w:spacing w:after="40"/>
+            </w:pPr>
+            <w:r>
+              <w:rPr>
+                <w:sz w:val="19"/>
+              </w:rPr>
+              <w:t>3.6</w:t>
+            </w:r>
+          </w:p>
+        </w:tc>
+        <w:tc>
+          <w:tcPr>
+            <w:tcW w:w="1531" w:type="dxa"/>
+          </w:tcPr>
+          <w:p>
+            <w:pPr>
+              <w:spacing w:after="40"/>
+            </w:pPr>
+            <w:r>
+              <w:rPr>
+                <w:sz w:val="19"/>
+              </w:rPr>
+              <w:t>3.6</w:t>
+            </w:r>
+          </w:p>
+        </w:tc>
+        <w:tc>
+          <w:tcPr>
+            <w:tcW w:w="1928" w:type="dxa"/>
+          </w:tcPr>
+          <w:p>
+            <w:pPr>
+              <w:spacing w:after="40"/>
+            </w:pPr>
+            <w:r>
+              <w:rPr>
+                <w:sz w:val="19"/>
+              </w:rPr>
+              <w:t>8.6</w:t>
             </w:r>
           </w:p>
         </w:tc>
@@ -4349,7 +5030,7 @@
     </w:p>
     <w:p>
       <w:r>
-        <w:t>In 2021 the increment must be zero and agricultural water use must be 10.8 billion m3 in all scenarios.</w:t>
+        <w:t>In 2021 the increment must be zero and agricultural water use must be 10.8 billion m3 in all scenarios. Sector reuse plus mitigation wastewater should stay within wwater_collectable (see section 12 for the exception). In the transformation scenario the wastewater limit holds tree planting to 8.6 Mt in 2060.</w:t>
       </w:r>
     </w:p>
     <w:p>
@@ -4392,6 +5073,24 @@
       </w:pPr>
       <w:r>
         <w:t>If the water module fails to load in the calibration, the fallback sets the old arrays to zero but not the new inputs of section 8.2.1. A run with the coupling switched on would then stop with a missing attribute.</w:t>
+      </w:r>
+    </w:p>
+    <w:p>
+      <w:pPr>
+        <w:pStyle w:val="ListBullet"/>
+        <w:spacing w:after="60"/>
+      </w:pPr>
+      <w:r>
+        <w:t>The wastewater available for mitigation is projected from t-1. If water use jumps from one year to the next, sector reuse plus mitigation wastewater can slightly exceed wwater_collectable in that year.</w:t>
+      </w:r>
+    </w:p>
+    <w:p>
+      <w:pPr>
+        <w:pStyle w:val="ListBullet"/>
+        <w:spacing w:after="60"/>
+      </w:pPr>
+      <w:r>
+        <w:t>The Vision 2030 run is sensitive to small changes in electricity demand (section 6.4). After porting, compare all scenarios with saved results.</w:t>
       </w:r>
     </w:p>
     <w:sectPr>

</xml_diff>